<commit_message>
fix: rename VIP gift fee label
</commit_message>
<xml_diff>
--- a/docs/PLAYER_PROFILE_SPEC_v1.docx
+++ b/docs/PLAYER_PROFILE_SPEC_v1.docx
@@ -5884,14 +5884,6 @@
             </w:pPr>
             <w:r>
               <w:rPr>
-                <w:rFonts w:ascii="Arial Unicode MS" w:hAnsi="Arial Unicode MS" w:eastAsia="Arial Unicode MS" w:cs="Arial Unicode MS"/>
-                <w:color w:val="172033"/>
-                <w:sz w:val="19"/>
-              </w:rPr>
-              <w:t xml:space="preserve">P2P </w:t>
-            </w:r>
-            <w:r>
-              <w:rPr>
                 <w:rFonts w:hint="eastAsia" w:ascii="Arial Unicode MS" w:hAnsi="Arial Unicode MS" w:eastAsia="Arial Unicode MS" w:cs="Arial Unicode MS"/>
                 <w:color w:val="172033"/>
                 <w:sz w:val="19"/>
@@ -6048,19 +6040,7 @@
         <w:rPr>
           <w:rFonts w:hint="eastAsia" w:ascii="Arial Unicode MS" w:hAnsi="Arial Unicode MS" w:eastAsia="Arial Unicode MS" w:cs="Arial Unicode MS"/>
         </w:rPr>
-        <w:t xml:space="preserve">VIP0～VIP15。欄位依序為等級、升級條件、保級條件、升級獎勵與</w:t>
-      </w:r>
-      <w:r>
-        <w:rPr>
-          <w:rFonts w:ascii="Arial Unicode MS" w:hAnsi="Arial Unicode MS" w:eastAsia="Arial Unicode MS" w:cs="Arial Unicode MS"/>
-        </w:rPr>
-        <w:t xml:space="preserve"> P2P </w:t>
-      </w:r>
-      <w:r>
-        <w:rPr>
-          <w:rFonts w:hint="eastAsia" w:ascii="Arial Unicode MS" w:hAnsi="Arial Unicode MS" w:eastAsia="Arial Unicode MS" w:cs="Arial Unicode MS"/>
-        </w:rPr>
-        <w:t xml:space="preserve">手續費。</w:t>
+        <w:t xml:space="preserve">VIP0～VIP15。欄位依序為等級、升級條件、保級條件、升級獎勵與贈禮手續費。</w:t>
       </w:r>
     </w:p>
     <w:bookmarkEnd w:id="18"/>
@@ -10574,14 +10554,6 @@
             </w:pPr>
             <w:r>
               <w:rPr>
-                <w:rFonts w:ascii="Arial Unicode MS" w:hAnsi="Arial Unicode MS" w:eastAsia="Arial Unicode MS" w:cs="Arial Unicode MS"/>
-                <w:color w:val="172033"/>
-                <w:sz w:val="18"/>
-              </w:rPr>
-              <w:t xml:space="preserve">P2P </w:t>
-            </w:r>
-            <w:r>
-              <w:rPr>
                 <w:rFonts w:hint="eastAsia" w:ascii="Arial Unicode MS" w:hAnsi="Arial Unicode MS" w:eastAsia="Arial Unicode MS" w:cs="Arial Unicode MS"/>
                 <w:color w:val="172033"/>
                 <w:sz w:val="18"/>
@@ -11970,12 +11942,12 @@
         </w:tblBorders>
       </w:tblPr>
       <w:tblGrid>
-        <w:gridCol w:w="1250"/>
         <w:gridCol w:w="1150"/>
-        <w:gridCol w:w="1950"/>
-        <w:gridCol w:w="2200"/>
-        <w:gridCol w:w="1700"/>
-        <w:gridCol w:w="1110"/>
+        <w:gridCol w:w="1100"/>
+        <w:gridCol w:w="1900"/>
+        <w:gridCol w:w="2100"/>
+        <w:gridCol w:w="1560"/>
+        <w:gridCol w:w="1550"/>
       </w:tblGrid>
       <w:tr>
         <w:trPr>
@@ -11984,7 +11956,7 @@
         </w:trPr>
         <w:tc>
           <w:tcPr>
-            <w:tcW w:w="1250" w:type="dxa"/>
+            <w:tcW w:w="1150" w:type="dxa"/>
             <w:tcMar>
               <w:top w:w="80" w:type="dxa"/>
               <w:start w:w="120" w:type="dxa"/>
@@ -12013,7 +11985,7 @@
         </w:tc>
         <w:tc>
           <w:tcPr>
-            <w:tcW w:w="1150" w:type="dxa"/>
+            <w:tcW w:w="1100" w:type="dxa"/>
             <w:tcMar>
               <w:top w:w="80" w:type="dxa"/>
               <w:start w:w="120" w:type="dxa"/>
@@ -12042,7 +12014,7 @@
         </w:tc>
         <w:tc>
           <w:tcPr>
-            <w:tcW w:w="1950" w:type="dxa"/>
+            <w:tcW w:w="1900" w:type="dxa"/>
             <w:tcMar>
               <w:top w:w="80" w:type="dxa"/>
               <w:start w:w="120" w:type="dxa"/>
@@ -12071,7 +12043,7 @@
         </w:tc>
         <w:tc>
           <w:tcPr>
-            <w:tcW w:w="2200" w:type="dxa"/>
+            <w:tcW w:w="2100" w:type="dxa"/>
             <w:tcMar>
               <w:top w:w="80" w:type="dxa"/>
               <w:start w:w="120" w:type="dxa"/>
@@ -12100,7 +12072,7 @@
         </w:tc>
         <w:tc>
           <w:tcPr>
-            <w:tcW w:w="1700" w:type="dxa"/>
+            <w:tcW w:w="1560" w:type="dxa"/>
             <w:tcMar>
               <w:top w:w="80" w:type="dxa"/>
               <w:start w:w="120" w:type="dxa"/>
@@ -12129,7 +12101,7 @@
         </w:tc>
         <w:tc>
           <w:tcPr>
-            <w:tcW w:w="1110" w:type="dxa"/>
+            <w:tcW w:w="1550" w:type="dxa"/>
             <w:tcMar>
               <w:top w:w="80" w:type="dxa"/>
               <w:start w:w="120" w:type="dxa"/>
@@ -12143,16 +12115,16 @@
             <w:pPr>
               <w:pStyle w:val="Compact"/>
               <w:spacing w:before="0" w:after="40" w:line="276" w:lineRule="auto"/>
-              <w:jc w:val="center"/>
-            </w:pPr>
-            <w:r>
-              <w:rPr>
-                <w:rFonts w:ascii="Arial Unicode MS" w:hAnsi="Arial Unicode MS" w:eastAsia="Arial Unicode MS" w:cs="Arial Unicode MS"/>
+              <w:jc w:val="left"/>
+            </w:pPr>
+            <w:r>
+              <w:rPr>
+                <w:rFonts w:hint="eastAsia" w:ascii="Arial Unicode MS" w:hAnsi="Arial Unicode MS" w:eastAsia="Arial Unicode MS" w:cs="Arial Unicode MS"/>
                 <w:b/>
                 <w:color w:val="172033"/>
                 <w:sz w:val="18"/>
               </w:rPr>
-              <w:t xml:space="preserve">P2P</w:t>
+              <w:t xml:space="preserve">贈禮手續費</w:t>
             </w:r>
           </w:p>
         </w:tc>
@@ -12163,7 +12135,7 @@
         </w:trPr>
         <w:tc>
           <w:tcPr>
-            <w:tcW w:w="1250" w:type="dxa"/>
+            <w:tcW w:w="1150" w:type="dxa"/>
             <w:tcMar>
               <w:top w:w="80" w:type="dxa"/>
               <w:start w:w="120" w:type="dxa"/>
@@ -12190,7 +12162,7 @@
         </w:tc>
         <w:tc>
           <w:tcPr>
-            <w:tcW w:w="1150" w:type="dxa"/>
+            <w:tcW w:w="1100" w:type="dxa"/>
             <w:tcMar>
               <w:top w:w="80" w:type="dxa"/>
               <w:start w:w="120" w:type="dxa"/>
@@ -12217,7 +12189,7 @@
         </w:tc>
         <w:tc>
           <w:tcPr>
-            <w:tcW w:w="1950" w:type="dxa"/>
+            <w:tcW w:w="1900" w:type="dxa"/>
             <w:tcMar>
               <w:top w:w="80" w:type="dxa"/>
               <w:start w:w="120" w:type="dxa"/>
@@ -12244,7 +12216,7 @@
         </w:tc>
         <w:tc>
           <w:tcPr>
-            <w:tcW w:w="2200" w:type="dxa"/>
+            <w:tcW w:w="2100" w:type="dxa"/>
             <w:tcMar>
               <w:top w:w="80" w:type="dxa"/>
               <w:start w:w="120" w:type="dxa"/>
@@ -12271,7 +12243,7 @@
         </w:tc>
         <w:tc>
           <w:tcPr>
-            <w:tcW w:w="1700" w:type="dxa"/>
+            <w:tcW w:w="1560" w:type="dxa"/>
             <w:tcMar>
               <w:top w:w="80" w:type="dxa"/>
               <w:start w:w="120" w:type="dxa"/>
@@ -12298,20 +12270,20 @@
         </w:tc>
         <w:tc>
           <w:tcPr>
-            <w:tcW w:w="1110" w:type="dxa"/>
-            <w:tcMar>
-              <w:top w:w="80" w:type="dxa"/>
-              <w:start w:w="120" w:type="dxa"/>
-              <w:bottom w:w="80" w:type="dxa"/>
-              <w:end w:w="120" w:type="dxa"/>
-            </w:tcMar>
-            <w:vAlign w:val="center"/>
-          </w:tcPr>
-          <w:p>
-            <w:pPr>
-              <w:pStyle w:val="Compact"/>
-              <w:spacing w:before="0" w:after="60" w:line="276" w:lineRule="auto"/>
-              <w:jc w:val="center"/>
+            <w:tcW w:w="1550" w:type="dxa"/>
+            <w:tcMar>
+              <w:top w:w="80" w:type="dxa"/>
+              <w:start w:w="120" w:type="dxa"/>
+              <w:bottom w:w="80" w:type="dxa"/>
+              <w:end w:w="120" w:type="dxa"/>
+            </w:tcMar>
+            <w:vAlign w:val="center"/>
+          </w:tcPr>
+          <w:p>
+            <w:pPr>
+              <w:pStyle w:val="Compact"/>
+              <w:spacing w:before="0" w:after="60" w:line="276" w:lineRule="auto"/>
+              <w:jc w:val="left"/>
             </w:pPr>
             <w:r>
               <w:rPr>
@@ -12330,7 +12302,7 @@
         </w:trPr>
         <w:tc>
           <w:tcPr>
-            <w:tcW w:w="1250" w:type="dxa"/>
+            <w:tcW w:w="1150" w:type="dxa"/>
             <w:tcMar>
               <w:top w:w="80" w:type="dxa"/>
               <w:start w:w="120" w:type="dxa"/>
@@ -12358,7 +12330,7 @@
         </w:tc>
         <w:tc>
           <w:tcPr>
-            <w:tcW w:w="1150" w:type="dxa"/>
+            <w:tcW w:w="1100" w:type="dxa"/>
             <w:tcMar>
               <w:top w:w="80" w:type="dxa"/>
               <w:start w:w="120" w:type="dxa"/>
@@ -12386,7 +12358,7 @@
         </w:tc>
         <w:tc>
           <w:tcPr>
-            <w:tcW w:w="1950" w:type="dxa"/>
+            <w:tcW w:w="1900" w:type="dxa"/>
             <w:tcMar>
               <w:top w:w="80" w:type="dxa"/>
               <w:start w:w="120" w:type="dxa"/>
@@ -12438,7 +12410,7 @@
         </w:tc>
         <w:tc>
           <w:tcPr>
-            <w:tcW w:w="2200" w:type="dxa"/>
+            <w:tcW w:w="2100" w:type="dxa"/>
             <w:tcMar>
               <w:top w:w="80" w:type="dxa"/>
               <w:start w:w="120" w:type="dxa"/>
@@ -12466,7 +12438,7 @@
         </w:tc>
         <w:tc>
           <w:tcPr>
-            <w:tcW w:w="1700" w:type="dxa"/>
+            <w:tcW w:w="1560" w:type="dxa"/>
             <w:tcMar>
               <w:top w:w="80" w:type="dxa"/>
               <w:start w:w="120" w:type="dxa"/>
@@ -12502,7 +12474,7 @@
         </w:tc>
         <w:tc>
           <w:tcPr>
-            <w:tcW w:w="1110" w:type="dxa"/>
+            <w:tcW w:w="1550" w:type="dxa"/>
             <w:tcMar>
               <w:top w:w="80" w:type="dxa"/>
               <w:start w:w="120" w:type="dxa"/>
@@ -12516,7 +12488,7 @@
             <w:pPr>
               <w:pStyle w:val="Compact"/>
               <w:spacing w:before="0" w:after="60" w:line="276" w:lineRule="auto"/>
-              <w:jc w:val="center"/>
+              <w:jc w:val="left"/>
             </w:pPr>
             <w:r>
               <w:rPr>
@@ -12535,7 +12507,7 @@
         </w:trPr>
         <w:tc>
           <w:tcPr>
-            <w:tcW w:w="1250" w:type="dxa"/>
+            <w:tcW w:w="1150" w:type="dxa"/>
             <w:tcMar>
               <w:top w:w="80" w:type="dxa"/>
               <w:start w:w="120" w:type="dxa"/>
@@ -12562,7 +12534,7 @@
         </w:tc>
         <w:tc>
           <w:tcPr>
-            <w:tcW w:w="1150" w:type="dxa"/>
+            <w:tcW w:w="1100" w:type="dxa"/>
             <w:tcMar>
               <w:top w:w="80" w:type="dxa"/>
               <w:start w:w="120" w:type="dxa"/>
@@ -12589,7 +12561,7 @@
         </w:tc>
         <w:tc>
           <w:tcPr>
-            <w:tcW w:w="1950" w:type="dxa"/>
+            <w:tcW w:w="1900" w:type="dxa"/>
             <w:tcMar>
               <w:top w:w="80" w:type="dxa"/>
               <w:start w:w="120" w:type="dxa"/>
@@ -12616,7 +12588,7 @@
         </w:tc>
         <w:tc>
           <w:tcPr>
-            <w:tcW w:w="2200" w:type="dxa"/>
+            <w:tcW w:w="2100" w:type="dxa"/>
             <w:tcMar>
               <w:top w:w="80" w:type="dxa"/>
               <w:start w:w="120" w:type="dxa"/>
@@ -12643,7 +12615,7 @@
         </w:tc>
         <w:tc>
           <w:tcPr>
-            <w:tcW w:w="1700" w:type="dxa"/>
+            <w:tcW w:w="1560" w:type="dxa"/>
             <w:tcMar>
               <w:top w:w="80" w:type="dxa"/>
               <w:start w:w="120" w:type="dxa"/>
@@ -12678,20 +12650,20 @@
         </w:tc>
         <w:tc>
           <w:tcPr>
-            <w:tcW w:w="1110" w:type="dxa"/>
-            <w:tcMar>
-              <w:top w:w="80" w:type="dxa"/>
-              <w:start w:w="120" w:type="dxa"/>
-              <w:bottom w:w="80" w:type="dxa"/>
-              <w:end w:w="120" w:type="dxa"/>
-            </w:tcMar>
-            <w:vAlign w:val="center"/>
-          </w:tcPr>
-          <w:p>
-            <w:pPr>
-              <w:pStyle w:val="Compact"/>
-              <w:spacing w:before="0" w:after="60" w:line="276" w:lineRule="auto"/>
-              <w:jc w:val="center"/>
+            <w:tcW w:w="1550" w:type="dxa"/>
+            <w:tcMar>
+              <w:top w:w="80" w:type="dxa"/>
+              <w:start w:w="120" w:type="dxa"/>
+              <w:bottom w:w="80" w:type="dxa"/>
+              <w:end w:w="120" w:type="dxa"/>
+            </w:tcMar>
+            <w:vAlign w:val="center"/>
+          </w:tcPr>
+          <w:p>
+            <w:pPr>
+              <w:pStyle w:val="Compact"/>
+              <w:spacing w:before="0" w:after="60" w:line="276" w:lineRule="auto"/>
+              <w:jc w:val="left"/>
             </w:pPr>
             <w:r>
               <w:rPr>
@@ -12710,7 +12682,7 @@
         </w:trPr>
         <w:tc>
           <w:tcPr>
-            <w:tcW w:w="1250" w:type="dxa"/>
+            <w:tcW w:w="1150" w:type="dxa"/>
             <w:tcMar>
               <w:top w:w="80" w:type="dxa"/>
               <w:start w:w="120" w:type="dxa"/>
@@ -12738,7 +12710,7 @@
         </w:tc>
         <w:tc>
           <w:tcPr>
-            <w:tcW w:w="1150" w:type="dxa"/>
+            <w:tcW w:w="1100" w:type="dxa"/>
             <w:tcMar>
               <w:top w:w="80" w:type="dxa"/>
               <w:start w:w="120" w:type="dxa"/>
@@ -12766,7 +12738,7 @@
         </w:tc>
         <w:tc>
           <w:tcPr>
-            <w:tcW w:w="1950" w:type="dxa"/>
+            <w:tcW w:w="1900" w:type="dxa"/>
             <w:tcMar>
               <w:top w:w="80" w:type="dxa"/>
               <w:start w:w="120" w:type="dxa"/>
@@ -12818,7 +12790,7 @@
         </w:tc>
         <w:tc>
           <w:tcPr>
-            <w:tcW w:w="2200" w:type="dxa"/>
+            <w:tcW w:w="2100" w:type="dxa"/>
             <w:tcMar>
               <w:top w:w="80" w:type="dxa"/>
               <w:start w:w="120" w:type="dxa"/>
@@ -12894,7 +12866,7 @@
         </w:tc>
         <w:tc>
           <w:tcPr>
-            <w:tcW w:w="1700" w:type="dxa"/>
+            <w:tcW w:w="1560" w:type="dxa"/>
             <w:tcMar>
               <w:top w:w="80" w:type="dxa"/>
               <w:start w:w="120" w:type="dxa"/>
@@ -12930,7 +12902,7 @@
         </w:tc>
         <w:tc>
           <w:tcPr>
-            <w:tcW w:w="1110" w:type="dxa"/>
+            <w:tcW w:w="1550" w:type="dxa"/>
             <w:tcMar>
               <w:top w:w="80" w:type="dxa"/>
               <w:start w:w="120" w:type="dxa"/>
@@ -12944,7 +12916,7 @@
             <w:pPr>
               <w:pStyle w:val="Compact"/>
               <w:spacing w:before="0" w:after="60" w:line="276" w:lineRule="auto"/>
-              <w:jc w:val="center"/>
+              <w:jc w:val="left"/>
             </w:pPr>
             <w:r>
               <w:rPr>
@@ -12963,7 +12935,7 @@
         </w:trPr>
         <w:tc>
           <w:tcPr>
-            <w:tcW w:w="1250" w:type="dxa"/>
+            <w:tcW w:w="1150" w:type="dxa"/>
             <w:tcMar>
               <w:top w:w="80" w:type="dxa"/>
               <w:start w:w="120" w:type="dxa"/>
@@ -12990,7 +12962,7 @@
         </w:tc>
         <w:tc>
           <w:tcPr>
-            <w:tcW w:w="1150" w:type="dxa"/>
+            <w:tcW w:w="1100" w:type="dxa"/>
             <w:tcMar>
               <w:top w:w="80" w:type="dxa"/>
               <w:start w:w="120" w:type="dxa"/>
@@ -13017,7 +12989,7 @@
         </w:tc>
         <w:tc>
           <w:tcPr>
-            <w:tcW w:w="1950" w:type="dxa"/>
+            <w:tcW w:w="1900" w:type="dxa"/>
             <w:tcMar>
               <w:top w:w="80" w:type="dxa"/>
               <w:start w:w="120" w:type="dxa"/>
@@ -13068,7 +13040,7 @@
         </w:tc>
         <w:tc>
           <w:tcPr>
-            <w:tcW w:w="2200" w:type="dxa"/>
+            <w:tcW w:w="2100" w:type="dxa"/>
             <w:tcMar>
               <w:top w:w="80" w:type="dxa"/>
               <w:start w:w="120" w:type="dxa"/>
@@ -13143,7 +13115,7 @@
         </w:tc>
         <w:tc>
           <w:tcPr>
-            <w:tcW w:w="1700" w:type="dxa"/>
+            <w:tcW w:w="1560" w:type="dxa"/>
             <w:tcMar>
               <w:top w:w="80" w:type="dxa"/>
               <w:start w:w="120" w:type="dxa"/>
@@ -13178,20 +13150,20 @@
         </w:tc>
         <w:tc>
           <w:tcPr>
-            <w:tcW w:w="1110" w:type="dxa"/>
-            <w:tcMar>
-              <w:top w:w="80" w:type="dxa"/>
-              <w:start w:w="120" w:type="dxa"/>
-              <w:bottom w:w="80" w:type="dxa"/>
-              <w:end w:w="120" w:type="dxa"/>
-            </w:tcMar>
-            <w:vAlign w:val="center"/>
-          </w:tcPr>
-          <w:p>
-            <w:pPr>
-              <w:pStyle w:val="Compact"/>
-              <w:spacing w:before="0" w:after="60" w:line="276" w:lineRule="auto"/>
-              <w:jc w:val="center"/>
+            <w:tcW w:w="1550" w:type="dxa"/>
+            <w:tcMar>
+              <w:top w:w="80" w:type="dxa"/>
+              <w:start w:w="120" w:type="dxa"/>
+              <w:bottom w:w="80" w:type="dxa"/>
+              <w:end w:w="120" w:type="dxa"/>
+            </w:tcMar>
+            <w:vAlign w:val="center"/>
+          </w:tcPr>
+          <w:p>
+            <w:pPr>
+              <w:pStyle w:val="Compact"/>
+              <w:spacing w:before="0" w:after="60" w:line="276" w:lineRule="auto"/>
+              <w:jc w:val="left"/>
             </w:pPr>
             <w:r>
               <w:rPr>
@@ -13210,7 +13182,7 @@
         </w:trPr>
         <w:tc>
           <w:tcPr>
-            <w:tcW w:w="1250" w:type="dxa"/>
+            <w:tcW w:w="1150" w:type="dxa"/>
             <w:tcMar>
               <w:top w:w="80" w:type="dxa"/>
               <w:start w:w="120" w:type="dxa"/>
@@ -13238,7 +13210,7 @@
         </w:tc>
         <w:tc>
           <w:tcPr>
-            <w:tcW w:w="1150" w:type="dxa"/>
+            <w:tcW w:w="1100" w:type="dxa"/>
             <w:tcMar>
               <w:top w:w="80" w:type="dxa"/>
               <w:start w:w="120" w:type="dxa"/>
@@ -13266,7 +13238,7 @@
         </w:tc>
         <w:tc>
           <w:tcPr>
-            <w:tcW w:w="1950" w:type="dxa"/>
+            <w:tcW w:w="1900" w:type="dxa"/>
             <w:tcMar>
               <w:top w:w="80" w:type="dxa"/>
               <w:start w:w="120" w:type="dxa"/>
@@ -13318,7 +13290,7 @@
         </w:tc>
         <w:tc>
           <w:tcPr>
-            <w:tcW w:w="2200" w:type="dxa"/>
+            <w:tcW w:w="2100" w:type="dxa"/>
             <w:tcMar>
               <w:top w:w="80" w:type="dxa"/>
               <w:start w:w="120" w:type="dxa"/>
@@ -13394,7 +13366,7 @@
         </w:tc>
         <w:tc>
           <w:tcPr>
-            <w:tcW w:w="1700" w:type="dxa"/>
+            <w:tcW w:w="1560" w:type="dxa"/>
             <w:tcMar>
               <w:top w:w="80" w:type="dxa"/>
               <w:start w:w="120" w:type="dxa"/>
@@ -13430,7 +13402,7 @@
         </w:tc>
         <w:tc>
           <w:tcPr>
-            <w:tcW w:w="1110" w:type="dxa"/>
+            <w:tcW w:w="1550" w:type="dxa"/>
             <w:tcMar>
               <w:top w:w="80" w:type="dxa"/>
               <w:start w:w="120" w:type="dxa"/>
@@ -13444,7 +13416,7 @@
             <w:pPr>
               <w:pStyle w:val="Compact"/>
               <w:spacing w:before="0" w:after="60" w:line="276" w:lineRule="auto"/>
-              <w:jc w:val="center"/>
+              <w:jc w:val="left"/>
             </w:pPr>
             <w:r>
               <w:rPr>
@@ -13463,7 +13435,7 @@
         </w:trPr>
         <w:tc>
           <w:tcPr>
-            <w:tcW w:w="1250" w:type="dxa"/>
+            <w:tcW w:w="1150" w:type="dxa"/>
             <w:tcMar>
               <w:top w:w="80" w:type="dxa"/>
               <w:start w:w="120" w:type="dxa"/>
@@ -13490,7 +13462,7 @@
         </w:tc>
         <w:tc>
           <w:tcPr>
-            <w:tcW w:w="1150" w:type="dxa"/>
+            <w:tcW w:w="1100" w:type="dxa"/>
             <w:tcMar>
               <w:top w:w="80" w:type="dxa"/>
               <w:start w:w="120" w:type="dxa"/>
@@ -13517,7 +13489,7 @@
         </w:tc>
         <w:tc>
           <w:tcPr>
-            <w:tcW w:w="1950" w:type="dxa"/>
+            <w:tcW w:w="1900" w:type="dxa"/>
             <w:tcMar>
               <w:top w:w="80" w:type="dxa"/>
               <w:start w:w="120" w:type="dxa"/>
@@ -13568,7 +13540,7 @@
         </w:tc>
         <w:tc>
           <w:tcPr>
-            <w:tcW w:w="2200" w:type="dxa"/>
+            <w:tcW w:w="2100" w:type="dxa"/>
             <w:tcMar>
               <w:top w:w="80" w:type="dxa"/>
               <w:start w:w="120" w:type="dxa"/>
@@ -13643,7 +13615,7 @@
         </w:tc>
         <w:tc>
           <w:tcPr>
-            <w:tcW w:w="1700" w:type="dxa"/>
+            <w:tcW w:w="1560" w:type="dxa"/>
             <w:tcMar>
               <w:top w:w="80" w:type="dxa"/>
               <w:start w:w="120" w:type="dxa"/>
@@ -13678,20 +13650,20 @@
         </w:tc>
         <w:tc>
           <w:tcPr>
-            <w:tcW w:w="1110" w:type="dxa"/>
-            <w:tcMar>
-              <w:top w:w="80" w:type="dxa"/>
-              <w:start w:w="120" w:type="dxa"/>
-              <w:bottom w:w="80" w:type="dxa"/>
-              <w:end w:w="120" w:type="dxa"/>
-            </w:tcMar>
-            <w:vAlign w:val="center"/>
-          </w:tcPr>
-          <w:p>
-            <w:pPr>
-              <w:pStyle w:val="Compact"/>
-              <w:spacing w:before="0" w:after="60" w:line="276" w:lineRule="auto"/>
-              <w:jc w:val="center"/>
+            <w:tcW w:w="1550" w:type="dxa"/>
+            <w:tcMar>
+              <w:top w:w="80" w:type="dxa"/>
+              <w:start w:w="120" w:type="dxa"/>
+              <w:bottom w:w="80" w:type="dxa"/>
+              <w:end w:w="120" w:type="dxa"/>
+            </w:tcMar>
+            <w:vAlign w:val="center"/>
+          </w:tcPr>
+          <w:p>
+            <w:pPr>
+              <w:pStyle w:val="Compact"/>
+              <w:spacing w:before="0" w:after="60" w:line="276" w:lineRule="auto"/>
+              <w:jc w:val="left"/>
             </w:pPr>
             <w:r>
               <w:rPr>
@@ -13710,7 +13682,7 @@
         </w:trPr>
         <w:tc>
           <w:tcPr>
-            <w:tcW w:w="1250" w:type="dxa"/>
+            <w:tcW w:w="1150" w:type="dxa"/>
             <w:tcMar>
               <w:top w:w="80" w:type="dxa"/>
               <w:start w:w="120" w:type="dxa"/>
@@ -13738,7 +13710,7 @@
         </w:tc>
         <w:tc>
           <w:tcPr>
-            <w:tcW w:w="1150" w:type="dxa"/>
+            <w:tcW w:w="1100" w:type="dxa"/>
             <w:tcMar>
               <w:top w:w="80" w:type="dxa"/>
               <w:start w:w="120" w:type="dxa"/>
@@ -13766,7 +13738,7 @@
         </w:tc>
         <w:tc>
           <w:tcPr>
-            <w:tcW w:w="1950" w:type="dxa"/>
+            <w:tcW w:w="1900" w:type="dxa"/>
             <w:tcMar>
               <w:top w:w="80" w:type="dxa"/>
               <w:start w:w="120" w:type="dxa"/>
@@ -13818,7 +13790,7 @@
         </w:tc>
         <w:tc>
           <w:tcPr>
-            <w:tcW w:w="2200" w:type="dxa"/>
+            <w:tcW w:w="2100" w:type="dxa"/>
             <w:tcMar>
               <w:top w:w="80" w:type="dxa"/>
               <w:start w:w="120" w:type="dxa"/>
@@ -13894,7 +13866,7 @@
         </w:tc>
         <w:tc>
           <w:tcPr>
-            <w:tcW w:w="1700" w:type="dxa"/>
+            <w:tcW w:w="1560" w:type="dxa"/>
             <w:tcMar>
               <w:top w:w="80" w:type="dxa"/>
               <w:start w:w="120" w:type="dxa"/>
@@ -13930,7 +13902,7 @@
         </w:tc>
         <w:tc>
           <w:tcPr>
-            <w:tcW w:w="1110" w:type="dxa"/>
+            <w:tcW w:w="1550" w:type="dxa"/>
             <w:tcMar>
               <w:top w:w="80" w:type="dxa"/>
               <w:start w:w="120" w:type="dxa"/>
@@ -13944,7 +13916,7 @@
             <w:pPr>
               <w:pStyle w:val="Compact"/>
               <w:spacing w:before="0" w:after="60" w:line="276" w:lineRule="auto"/>
-              <w:jc w:val="center"/>
+              <w:jc w:val="left"/>
             </w:pPr>
             <w:r>
               <w:rPr>
@@ -13963,7 +13935,7 @@
         </w:trPr>
         <w:tc>
           <w:tcPr>
-            <w:tcW w:w="1250" w:type="dxa"/>
+            <w:tcW w:w="1150" w:type="dxa"/>
             <w:tcMar>
               <w:top w:w="80" w:type="dxa"/>
               <w:start w:w="120" w:type="dxa"/>
@@ -13990,7 +13962,7 @@
         </w:tc>
         <w:tc>
           <w:tcPr>
-            <w:tcW w:w="1150" w:type="dxa"/>
+            <w:tcW w:w="1100" w:type="dxa"/>
             <w:tcMar>
               <w:top w:w="80" w:type="dxa"/>
               <w:start w:w="120" w:type="dxa"/>
@@ -14017,7 +13989,7 @@
         </w:tc>
         <w:tc>
           <w:tcPr>
-            <w:tcW w:w="1950" w:type="dxa"/>
+            <w:tcW w:w="1900" w:type="dxa"/>
             <w:tcMar>
               <w:top w:w="80" w:type="dxa"/>
               <w:start w:w="120" w:type="dxa"/>
@@ -14068,7 +14040,7 @@
         </w:tc>
         <w:tc>
           <w:tcPr>
-            <w:tcW w:w="2200" w:type="dxa"/>
+            <w:tcW w:w="2100" w:type="dxa"/>
             <w:tcMar>
               <w:top w:w="80" w:type="dxa"/>
               <w:start w:w="120" w:type="dxa"/>
@@ -14143,7 +14115,7 @@
         </w:tc>
         <w:tc>
           <w:tcPr>
-            <w:tcW w:w="1700" w:type="dxa"/>
+            <w:tcW w:w="1560" w:type="dxa"/>
             <w:tcMar>
               <w:top w:w="80" w:type="dxa"/>
               <w:start w:w="120" w:type="dxa"/>
@@ -14178,20 +14150,20 @@
         </w:tc>
         <w:tc>
           <w:tcPr>
-            <w:tcW w:w="1110" w:type="dxa"/>
-            <w:tcMar>
-              <w:top w:w="80" w:type="dxa"/>
-              <w:start w:w="120" w:type="dxa"/>
-              <w:bottom w:w="80" w:type="dxa"/>
-              <w:end w:w="120" w:type="dxa"/>
-            </w:tcMar>
-            <w:vAlign w:val="center"/>
-          </w:tcPr>
-          <w:p>
-            <w:pPr>
-              <w:pStyle w:val="Compact"/>
-              <w:spacing w:before="0" w:after="60" w:line="276" w:lineRule="auto"/>
-              <w:jc w:val="center"/>
+            <w:tcW w:w="1550" w:type="dxa"/>
+            <w:tcMar>
+              <w:top w:w="80" w:type="dxa"/>
+              <w:start w:w="120" w:type="dxa"/>
+              <w:bottom w:w="80" w:type="dxa"/>
+              <w:end w:w="120" w:type="dxa"/>
+            </w:tcMar>
+            <w:vAlign w:val="center"/>
+          </w:tcPr>
+          <w:p>
+            <w:pPr>
+              <w:pStyle w:val="Compact"/>
+              <w:spacing w:before="0" w:after="60" w:line="276" w:lineRule="auto"/>
+              <w:jc w:val="left"/>
             </w:pPr>
             <w:r>
               <w:rPr>
@@ -14210,7 +14182,7 @@
         </w:trPr>
         <w:tc>
           <w:tcPr>
-            <w:tcW w:w="1250" w:type="dxa"/>
+            <w:tcW w:w="1150" w:type="dxa"/>
             <w:tcMar>
               <w:top w:w="80" w:type="dxa"/>
               <w:start w:w="120" w:type="dxa"/>
@@ -14238,7 +14210,7 @@
         </w:tc>
         <w:tc>
           <w:tcPr>
-            <w:tcW w:w="1150" w:type="dxa"/>
+            <w:tcW w:w="1100" w:type="dxa"/>
             <w:tcMar>
               <w:top w:w="80" w:type="dxa"/>
               <w:start w:w="120" w:type="dxa"/>
@@ -14266,7 +14238,7 @@
         </w:tc>
         <w:tc>
           <w:tcPr>
-            <w:tcW w:w="1950" w:type="dxa"/>
+            <w:tcW w:w="1900" w:type="dxa"/>
             <w:tcMar>
               <w:top w:w="80" w:type="dxa"/>
               <w:start w:w="120" w:type="dxa"/>
@@ -14318,7 +14290,7 @@
         </w:tc>
         <w:tc>
           <w:tcPr>
-            <w:tcW w:w="2200" w:type="dxa"/>
+            <w:tcW w:w="2100" w:type="dxa"/>
             <w:tcMar>
               <w:top w:w="80" w:type="dxa"/>
               <w:start w:w="120" w:type="dxa"/>
@@ -14394,7 +14366,7 @@
         </w:tc>
         <w:tc>
           <w:tcPr>
-            <w:tcW w:w="1700" w:type="dxa"/>
+            <w:tcW w:w="1560" w:type="dxa"/>
             <w:tcMar>
               <w:top w:w="80" w:type="dxa"/>
               <w:start w:w="120" w:type="dxa"/>
@@ -14430,7 +14402,7 @@
         </w:tc>
         <w:tc>
           <w:tcPr>
-            <w:tcW w:w="1110" w:type="dxa"/>
+            <w:tcW w:w="1550" w:type="dxa"/>
             <w:tcMar>
               <w:top w:w="80" w:type="dxa"/>
               <w:start w:w="120" w:type="dxa"/>
@@ -14444,7 +14416,7 @@
             <w:pPr>
               <w:pStyle w:val="Compact"/>
               <w:spacing w:before="0" w:after="60" w:line="276" w:lineRule="auto"/>
-              <w:jc w:val="center"/>
+              <w:jc w:val="left"/>
             </w:pPr>
             <w:r>
               <w:rPr>
@@ -14463,7 +14435,7 @@
         </w:trPr>
         <w:tc>
           <w:tcPr>
-            <w:tcW w:w="1250" w:type="dxa"/>
+            <w:tcW w:w="1150" w:type="dxa"/>
             <w:tcMar>
               <w:top w:w="80" w:type="dxa"/>
               <w:start w:w="120" w:type="dxa"/>
@@ -14490,7 +14462,7 @@
         </w:tc>
         <w:tc>
           <w:tcPr>
-            <w:tcW w:w="1150" w:type="dxa"/>
+            <w:tcW w:w="1100" w:type="dxa"/>
             <w:tcMar>
               <w:top w:w="80" w:type="dxa"/>
               <w:start w:w="120" w:type="dxa"/>
@@ -14517,7 +14489,7 @@
         </w:tc>
         <w:tc>
           <w:tcPr>
-            <w:tcW w:w="1950" w:type="dxa"/>
+            <w:tcW w:w="1900" w:type="dxa"/>
             <w:tcMar>
               <w:top w:w="80" w:type="dxa"/>
               <w:start w:w="120" w:type="dxa"/>
@@ -14568,7 +14540,7 @@
         </w:tc>
         <w:tc>
           <w:tcPr>
-            <w:tcW w:w="2200" w:type="dxa"/>
+            <w:tcW w:w="2100" w:type="dxa"/>
             <w:tcMar>
               <w:top w:w="80" w:type="dxa"/>
               <w:start w:w="120" w:type="dxa"/>
@@ -14643,7 +14615,7 @@
         </w:tc>
         <w:tc>
           <w:tcPr>
-            <w:tcW w:w="1700" w:type="dxa"/>
+            <w:tcW w:w="1560" w:type="dxa"/>
             <w:tcMar>
               <w:top w:w="80" w:type="dxa"/>
               <w:start w:w="120" w:type="dxa"/>
@@ -14678,20 +14650,20 @@
         </w:tc>
         <w:tc>
           <w:tcPr>
-            <w:tcW w:w="1110" w:type="dxa"/>
-            <w:tcMar>
-              <w:top w:w="80" w:type="dxa"/>
-              <w:start w:w="120" w:type="dxa"/>
-              <w:bottom w:w="80" w:type="dxa"/>
-              <w:end w:w="120" w:type="dxa"/>
-            </w:tcMar>
-            <w:vAlign w:val="center"/>
-          </w:tcPr>
-          <w:p>
-            <w:pPr>
-              <w:pStyle w:val="Compact"/>
-              <w:spacing w:before="0" w:after="60" w:line="276" w:lineRule="auto"/>
-              <w:jc w:val="center"/>
+            <w:tcW w:w="1550" w:type="dxa"/>
+            <w:tcMar>
+              <w:top w:w="80" w:type="dxa"/>
+              <w:start w:w="120" w:type="dxa"/>
+              <w:bottom w:w="80" w:type="dxa"/>
+              <w:end w:w="120" w:type="dxa"/>
+            </w:tcMar>
+            <w:vAlign w:val="center"/>
+          </w:tcPr>
+          <w:p>
+            <w:pPr>
+              <w:pStyle w:val="Compact"/>
+              <w:spacing w:before="0" w:after="60" w:line="276" w:lineRule="auto"/>
+              <w:jc w:val="left"/>
             </w:pPr>
             <w:r>
               <w:rPr>
@@ -14710,7 +14682,7 @@
         </w:trPr>
         <w:tc>
           <w:tcPr>
-            <w:tcW w:w="1250" w:type="dxa"/>
+            <w:tcW w:w="1150" w:type="dxa"/>
             <w:tcMar>
               <w:top w:w="80" w:type="dxa"/>
               <w:start w:w="120" w:type="dxa"/>
@@ -14738,7 +14710,7 @@
         </w:tc>
         <w:tc>
           <w:tcPr>
-            <w:tcW w:w="1150" w:type="dxa"/>
+            <w:tcW w:w="1100" w:type="dxa"/>
             <w:tcMar>
               <w:top w:w="80" w:type="dxa"/>
               <w:start w:w="120" w:type="dxa"/>
@@ -14766,7 +14738,7 @@
         </w:tc>
         <w:tc>
           <w:tcPr>
-            <w:tcW w:w="1950" w:type="dxa"/>
+            <w:tcW w:w="1900" w:type="dxa"/>
             <w:tcMar>
               <w:top w:w="80" w:type="dxa"/>
               <w:start w:w="120" w:type="dxa"/>
@@ -14818,7 +14790,7 @@
         </w:tc>
         <w:tc>
           <w:tcPr>
-            <w:tcW w:w="2200" w:type="dxa"/>
+            <w:tcW w:w="2100" w:type="dxa"/>
             <w:tcMar>
               <w:top w:w="80" w:type="dxa"/>
               <w:start w:w="120" w:type="dxa"/>
@@ -14894,7 +14866,7 @@
         </w:tc>
         <w:tc>
           <w:tcPr>
-            <w:tcW w:w="1700" w:type="dxa"/>
+            <w:tcW w:w="1560" w:type="dxa"/>
             <w:tcMar>
               <w:top w:w="80" w:type="dxa"/>
               <w:start w:w="120" w:type="dxa"/>
@@ -14930,7 +14902,7 @@
         </w:tc>
         <w:tc>
           <w:tcPr>
-            <w:tcW w:w="1110" w:type="dxa"/>
+            <w:tcW w:w="1550" w:type="dxa"/>
             <w:tcMar>
               <w:top w:w="80" w:type="dxa"/>
               <w:start w:w="120" w:type="dxa"/>
@@ -14944,7 +14916,7 @@
             <w:pPr>
               <w:pStyle w:val="Compact"/>
               <w:spacing w:before="0" w:after="60" w:line="276" w:lineRule="auto"/>
-              <w:jc w:val="center"/>
+              <w:jc w:val="left"/>
             </w:pPr>
             <w:r>
               <w:rPr>
@@ -14963,7 +14935,7 @@
         </w:trPr>
         <w:tc>
           <w:tcPr>
-            <w:tcW w:w="1250" w:type="dxa"/>
+            <w:tcW w:w="1150" w:type="dxa"/>
             <w:tcMar>
               <w:top w:w="80" w:type="dxa"/>
               <w:start w:w="120" w:type="dxa"/>
@@ -14990,7 +14962,7 @@
         </w:tc>
         <w:tc>
           <w:tcPr>
-            <w:tcW w:w="1150" w:type="dxa"/>
+            <w:tcW w:w="1100" w:type="dxa"/>
             <w:tcMar>
               <w:top w:w="80" w:type="dxa"/>
               <w:start w:w="120" w:type="dxa"/>
@@ -15017,7 +14989,7 @@
         </w:tc>
         <w:tc>
           <w:tcPr>
-            <w:tcW w:w="1950" w:type="dxa"/>
+            <w:tcW w:w="1900" w:type="dxa"/>
             <w:tcMar>
               <w:top w:w="80" w:type="dxa"/>
               <w:start w:w="120" w:type="dxa"/>
@@ -15068,7 +15040,7 @@
         </w:tc>
         <w:tc>
           <w:tcPr>
-            <w:tcW w:w="2200" w:type="dxa"/>
+            <w:tcW w:w="2100" w:type="dxa"/>
             <w:tcMar>
               <w:top w:w="80" w:type="dxa"/>
               <w:start w:w="120" w:type="dxa"/>
@@ -15143,7 +15115,7 @@
         </w:tc>
         <w:tc>
           <w:tcPr>
-            <w:tcW w:w="1700" w:type="dxa"/>
+            <w:tcW w:w="1560" w:type="dxa"/>
             <w:tcMar>
               <w:top w:w="80" w:type="dxa"/>
               <w:start w:w="120" w:type="dxa"/>
@@ -15178,20 +15150,20 @@
         </w:tc>
         <w:tc>
           <w:tcPr>
-            <w:tcW w:w="1110" w:type="dxa"/>
-            <w:tcMar>
-              <w:top w:w="80" w:type="dxa"/>
-              <w:start w:w="120" w:type="dxa"/>
-              <w:bottom w:w="80" w:type="dxa"/>
-              <w:end w:w="120" w:type="dxa"/>
-            </w:tcMar>
-            <w:vAlign w:val="center"/>
-          </w:tcPr>
-          <w:p>
-            <w:pPr>
-              <w:pStyle w:val="Compact"/>
-              <w:spacing w:before="0" w:after="60" w:line="276" w:lineRule="auto"/>
-              <w:jc w:val="center"/>
+            <w:tcW w:w="1550" w:type="dxa"/>
+            <w:tcMar>
+              <w:top w:w="80" w:type="dxa"/>
+              <w:start w:w="120" w:type="dxa"/>
+              <w:bottom w:w="80" w:type="dxa"/>
+              <w:end w:w="120" w:type="dxa"/>
+            </w:tcMar>
+            <w:vAlign w:val="center"/>
+          </w:tcPr>
+          <w:p>
+            <w:pPr>
+              <w:pStyle w:val="Compact"/>
+              <w:spacing w:before="0" w:after="60" w:line="276" w:lineRule="auto"/>
+              <w:jc w:val="left"/>
             </w:pPr>
             <w:r>
               <w:rPr>
@@ -15210,7 +15182,7 @@
         </w:trPr>
         <w:tc>
           <w:tcPr>
-            <w:tcW w:w="1250" w:type="dxa"/>
+            <w:tcW w:w="1150" w:type="dxa"/>
             <w:tcMar>
               <w:top w:w="80" w:type="dxa"/>
               <w:start w:w="120" w:type="dxa"/>
@@ -15238,7 +15210,7 @@
         </w:tc>
         <w:tc>
           <w:tcPr>
-            <w:tcW w:w="1150" w:type="dxa"/>
+            <w:tcW w:w="1100" w:type="dxa"/>
             <w:tcMar>
               <w:top w:w="80" w:type="dxa"/>
               <w:start w:w="120" w:type="dxa"/>
@@ -15266,7 +15238,7 @@
         </w:tc>
         <w:tc>
           <w:tcPr>
-            <w:tcW w:w="1950" w:type="dxa"/>
+            <w:tcW w:w="1900" w:type="dxa"/>
             <w:tcMar>
               <w:top w:w="80" w:type="dxa"/>
               <w:start w:w="120" w:type="dxa"/>
@@ -15318,7 +15290,7 @@
         </w:tc>
         <w:tc>
           <w:tcPr>
-            <w:tcW w:w="2200" w:type="dxa"/>
+            <w:tcW w:w="2100" w:type="dxa"/>
             <w:tcMar>
               <w:top w:w="80" w:type="dxa"/>
               <w:start w:w="120" w:type="dxa"/>
@@ -15394,7 +15366,7 @@
         </w:tc>
         <w:tc>
           <w:tcPr>
-            <w:tcW w:w="1700" w:type="dxa"/>
+            <w:tcW w:w="1560" w:type="dxa"/>
             <w:tcMar>
               <w:top w:w="80" w:type="dxa"/>
               <w:start w:w="120" w:type="dxa"/>
@@ -15430,7 +15402,7 @@
         </w:tc>
         <w:tc>
           <w:tcPr>
-            <w:tcW w:w="1110" w:type="dxa"/>
+            <w:tcW w:w="1550" w:type="dxa"/>
             <w:tcMar>
               <w:top w:w="80" w:type="dxa"/>
               <w:start w:w="120" w:type="dxa"/>
@@ -15444,7 +15416,7 @@
             <w:pPr>
               <w:pStyle w:val="Compact"/>
               <w:spacing w:before="0" w:after="60" w:line="276" w:lineRule="auto"/>
-              <w:jc w:val="center"/>
+              <w:jc w:val="left"/>
             </w:pPr>
             <w:r>
               <w:rPr>
@@ -15463,7 +15435,7 @@
         </w:trPr>
         <w:tc>
           <w:tcPr>
-            <w:tcW w:w="1250" w:type="dxa"/>
+            <w:tcW w:w="1150" w:type="dxa"/>
             <w:tcMar>
               <w:top w:w="80" w:type="dxa"/>
               <w:start w:w="120" w:type="dxa"/>
@@ -15490,7 +15462,7 @@
         </w:tc>
         <w:tc>
           <w:tcPr>
-            <w:tcW w:w="1150" w:type="dxa"/>
+            <w:tcW w:w="1100" w:type="dxa"/>
             <w:tcMar>
               <w:top w:w="80" w:type="dxa"/>
               <w:start w:w="120" w:type="dxa"/>
@@ -15517,7 +15489,7 @@
         </w:tc>
         <w:tc>
           <w:tcPr>
-            <w:tcW w:w="1950" w:type="dxa"/>
+            <w:tcW w:w="1900" w:type="dxa"/>
             <w:tcMar>
               <w:top w:w="80" w:type="dxa"/>
               <w:start w:w="120" w:type="dxa"/>
@@ -15568,7 +15540,7 @@
         </w:tc>
         <w:tc>
           <w:tcPr>
-            <w:tcW w:w="2200" w:type="dxa"/>
+            <w:tcW w:w="2100" w:type="dxa"/>
             <w:tcMar>
               <w:top w:w="80" w:type="dxa"/>
               <w:start w:w="120" w:type="dxa"/>
@@ -15643,7 +15615,7 @@
         </w:tc>
         <w:tc>
           <w:tcPr>
-            <w:tcW w:w="1700" w:type="dxa"/>
+            <w:tcW w:w="1560" w:type="dxa"/>
             <w:tcMar>
               <w:top w:w="80" w:type="dxa"/>
               <w:start w:w="120" w:type="dxa"/>
@@ -15678,20 +15650,20 @@
         </w:tc>
         <w:tc>
           <w:tcPr>
-            <w:tcW w:w="1110" w:type="dxa"/>
-            <w:tcMar>
-              <w:top w:w="80" w:type="dxa"/>
-              <w:start w:w="120" w:type="dxa"/>
-              <w:bottom w:w="80" w:type="dxa"/>
-              <w:end w:w="120" w:type="dxa"/>
-            </w:tcMar>
-            <w:vAlign w:val="center"/>
-          </w:tcPr>
-          <w:p>
-            <w:pPr>
-              <w:pStyle w:val="Compact"/>
-              <w:spacing w:before="0" w:after="60" w:line="276" w:lineRule="auto"/>
-              <w:jc w:val="center"/>
+            <w:tcW w:w="1550" w:type="dxa"/>
+            <w:tcMar>
+              <w:top w:w="80" w:type="dxa"/>
+              <w:start w:w="120" w:type="dxa"/>
+              <w:bottom w:w="80" w:type="dxa"/>
+              <w:end w:w="120" w:type="dxa"/>
+            </w:tcMar>
+            <w:vAlign w:val="center"/>
+          </w:tcPr>
+          <w:p>
+            <w:pPr>
+              <w:pStyle w:val="Compact"/>
+              <w:spacing w:before="0" w:after="60" w:line="276" w:lineRule="auto"/>
+              <w:jc w:val="left"/>
             </w:pPr>
             <w:r>
               <w:rPr>
@@ -15710,7 +15682,7 @@
         </w:trPr>
         <w:tc>
           <w:tcPr>
-            <w:tcW w:w="1250" w:type="dxa"/>
+            <w:tcW w:w="1150" w:type="dxa"/>
             <w:tcMar>
               <w:top w:w="80" w:type="dxa"/>
               <w:start w:w="120" w:type="dxa"/>
@@ -15738,7 +15710,7 @@
         </w:tc>
         <w:tc>
           <w:tcPr>
-            <w:tcW w:w="1150" w:type="dxa"/>
+            <w:tcW w:w="1100" w:type="dxa"/>
             <w:tcMar>
               <w:top w:w="80" w:type="dxa"/>
               <w:start w:w="120" w:type="dxa"/>
@@ -15766,7 +15738,7 @@
         </w:tc>
         <w:tc>
           <w:tcPr>
-            <w:tcW w:w="1950" w:type="dxa"/>
+            <w:tcW w:w="1900" w:type="dxa"/>
             <w:tcMar>
               <w:top w:w="80" w:type="dxa"/>
               <w:start w:w="120" w:type="dxa"/>
@@ -15818,7 +15790,7 @@
         </w:tc>
         <w:tc>
           <w:tcPr>
-            <w:tcW w:w="2200" w:type="dxa"/>
+            <w:tcW w:w="2100" w:type="dxa"/>
             <w:tcMar>
               <w:top w:w="80" w:type="dxa"/>
               <w:start w:w="120" w:type="dxa"/>
@@ -15894,7 +15866,7 @@
         </w:tc>
         <w:tc>
           <w:tcPr>
-            <w:tcW w:w="1700" w:type="dxa"/>
+            <w:tcW w:w="1560" w:type="dxa"/>
             <w:tcMar>
               <w:top w:w="80" w:type="dxa"/>
               <w:start w:w="120" w:type="dxa"/>
@@ -15930,7 +15902,7 @@
         </w:tc>
         <w:tc>
           <w:tcPr>
-            <w:tcW w:w="1110" w:type="dxa"/>
+            <w:tcW w:w="1550" w:type="dxa"/>
             <w:tcMar>
               <w:top w:w="80" w:type="dxa"/>
               <w:start w:w="120" w:type="dxa"/>
@@ -15944,7 +15916,7 @@
             <w:pPr>
               <w:pStyle w:val="Compact"/>
               <w:spacing w:before="0" w:after="60" w:line="276" w:lineRule="auto"/>
-              <w:jc w:val="center"/>
+              <w:jc w:val="left"/>
             </w:pPr>
             <w:r>
               <w:rPr>
@@ -34673,23 +34645,7 @@
                 <w:color w:val="172033"/>
                 <w:sz w:val="19"/>
               </w:rPr>
-              <w:t xml:space="preserve">條件、獎勵與</w:t>
-            </w:r>
-            <w:r>
-              <w:rPr>
-                <w:rFonts w:ascii="Arial Unicode MS" w:hAnsi="Arial Unicode MS" w:eastAsia="Arial Unicode MS" w:cs="Arial Unicode MS"/>
-                <w:color w:val="172033"/>
-                <w:sz w:val="19"/>
-              </w:rPr>
-              <w:t xml:space="preserve"> P2P </w:t>
-            </w:r>
-            <w:r>
-              <w:rPr>
-                <w:rFonts w:hint="eastAsia" w:ascii="Arial Unicode MS" w:hAnsi="Arial Unicode MS" w:eastAsia="Arial Unicode MS" w:cs="Arial Unicode MS"/>
-                <w:color w:val="172033"/>
-                <w:sz w:val="19"/>
-              </w:rPr>
-              <w:t xml:space="preserve">符合第</w:t>
+              <w:t xml:space="preserve">條件、獎勵與贈禮手續費符合第</w:t>
             </w:r>
             <w:r>
               <w:rPr>
@@ -41890,23 +41846,7 @@
                 <w:color w:val="172033"/>
                 <w:sz w:val="19"/>
               </w:rPr>
-              <w:t xml:space="preserve">的</w:t>
-            </w:r>
-            <w:r>
-              <w:rPr>
-                <w:rFonts w:ascii="Arial Unicode MS" w:hAnsi="Arial Unicode MS" w:eastAsia="Arial Unicode MS" w:cs="Arial Unicode MS"/>
-                <w:color w:val="172033"/>
-                <w:sz w:val="19"/>
-              </w:rPr>
-              <w:t xml:space="preserve"> P2P </w:t>
-            </w:r>
-            <w:r>
-              <w:rPr>
-                <w:rFonts w:hint="eastAsia" w:ascii="Arial Unicode MS" w:hAnsi="Arial Unicode MS" w:eastAsia="Arial Unicode MS" w:cs="Arial Unicode MS"/>
-                <w:color w:val="172033"/>
-                <w:sz w:val="19"/>
-              </w:rPr>
-              <w:t xml:space="preserve">贈禮手續費是否維持全等級</w:t>
+              <w:t xml:space="preserve">的贈禮手續費是否維持全等級</w:t>
             </w:r>
             <w:r>
               <w:rPr>

</xml_diff>